<commit_message>
fix: align synthetic product names with competitor scraper names and update final reports
</commit_message>
<xml_diff>
--- a/report/capstone_final.docx
+++ b/report/capstone_final.docx
@@ -367,9 +367,8 @@
           <w:lang w:val="pt-BR"/>
           <w14:ligatures w14:val="standardContextual"/>
         </w:rPr>
-        <w:t xml:space="preserve">Muhammad </w:t>
-      </w:r>
-      <w:proofErr w:type="spellStart"/>
+        <w:t>Muhammad Ibtasam Ali (23-CS-88)</w:t>
+      </w:r>
       <w:r>
         <w:rPr>
           <w:rFonts w:ascii="Times New Roman" w:eastAsia="Aptos" w:hAnsi="Times New Roman" w:cs="Times New Roman"/>
@@ -379,29 +378,6 @@
           <w:lang w:val="pt-BR"/>
           <w14:ligatures w14:val="standardContextual"/>
         </w:rPr>
-        <w:t>Ibtasam</w:t>
-      </w:r>
-      <w:proofErr w:type="spellEnd"/>
-      <w:r>
-        <w:rPr>
-          <w:rFonts w:ascii="Times New Roman" w:eastAsia="Aptos" w:hAnsi="Times New Roman" w:cs="Times New Roman"/>
-          <w:kern w:val="2"/>
-          <w:sz w:val="32"/>
-          <w:szCs w:val="32"/>
-          <w:lang w:val="pt-BR"/>
-          <w14:ligatures w14:val="standardContextual"/>
-        </w:rPr>
-        <w:t xml:space="preserve"> Ali (23-CS-88)</w:t>
-      </w:r>
-      <w:r>
-        <w:rPr>
-          <w:rFonts w:ascii="Times New Roman" w:eastAsia="Aptos" w:hAnsi="Times New Roman" w:cs="Times New Roman"/>
-          <w:kern w:val="2"/>
-          <w:sz w:val="32"/>
-          <w:szCs w:val="32"/>
-          <w:lang w:val="pt-BR"/>
-          <w14:ligatures w14:val="standardContextual"/>
-        </w:rPr>
         <w:br/>
         <w:t>23-cs-@88students.uettaxila.edu.pk</w:t>
       </w:r>
@@ -426,7 +402,7 @@
           <w:szCs w:val="32"/>
           <w14:ligatures w14:val="standardContextual"/>
         </w:rPr>
-        <w:t>Ahmed Muneer (23-CS-98)</w:t>
+        <w:t>Ahmed Muneer (23-CS-9</w:t>
       </w:r>
       <w:r>
         <w:rPr>
@@ -436,8 +412,48 @@
           <w:szCs w:val="32"/>
           <w14:ligatures w14:val="standardContextual"/>
         </w:rPr>
+        <w:t>1</w:t>
+      </w:r>
+      <w:r>
+        <w:rPr>
+          <w:rFonts w:ascii="Times New Roman" w:eastAsia="Aptos" w:hAnsi="Times New Roman" w:cs="Times New Roman"/>
+          <w:kern w:val="2"/>
+          <w:sz w:val="32"/>
+          <w:szCs w:val="32"/>
+          <w14:ligatures w14:val="standardContextual"/>
+        </w:rPr>
+        <w:t>)</w:t>
+      </w:r>
+      <w:r>
+        <w:rPr>
+          <w:rFonts w:ascii="Times New Roman" w:eastAsia="Aptos" w:hAnsi="Times New Roman" w:cs="Times New Roman"/>
+          <w:kern w:val="2"/>
+          <w:sz w:val="32"/>
+          <w:szCs w:val="32"/>
+          <w14:ligatures w14:val="standardContextual"/>
+        </w:rPr>
         <w:br/>
-        <w:t>23-cs-98@students.uettaxila.edu.pk</w:t>
+        <w:t>23-cs-9</w:t>
+      </w:r>
+      <w:r>
+        <w:rPr>
+          <w:rFonts w:ascii="Times New Roman" w:eastAsia="Aptos" w:hAnsi="Times New Roman" w:cs="Times New Roman"/>
+          <w:kern w:val="2"/>
+          <w:sz w:val="32"/>
+          <w:szCs w:val="32"/>
+          <w14:ligatures w14:val="standardContextual"/>
+        </w:rPr>
+        <w:t>1</w:t>
+      </w:r>
+      <w:r>
+        <w:rPr>
+          <w:rFonts w:ascii="Times New Roman" w:eastAsia="Aptos" w:hAnsi="Times New Roman" w:cs="Times New Roman"/>
+          <w:kern w:val="2"/>
+          <w:sz w:val="32"/>
+          <w:szCs w:val="32"/>
+          <w14:ligatures w14:val="standardContextual"/>
+        </w:rPr>
+        <w:t>@students.uettaxila.edu.pk</w:t>
       </w:r>
     </w:p>
     <w:p>
@@ -584,25 +600,7 @@
           <w:sz w:val="24"/>
           <w:szCs w:val="24"/>
         </w:rPr>
-        <w:t xml:space="preserve">This capstone project presents a comprehensive enterprise-grade retail analytics platform designed to demonstrate modern data engineering and business intelligence practices. The system integrates synthetic data generation, cloud-based data warehousing on Snowflake, dimensional modeling with </w:t>
-      </w:r>
-      <w:proofErr w:type="spellStart"/>
-      <w:r>
-        <w:rPr>
-          <w:rFonts w:ascii="Times New Roman" w:hAnsi="Times New Roman" w:cs="Times New Roman"/>
-          <w:sz w:val="24"/>
-          <w:szCs w:val="24"/>
-        </w:rPr>
-        <w:t>dbt</w:t>
-      </w:r>
-      <w:proofErr w:type="spellEnd"/>
-      <w:r>
-        <w:rPr>
-          <w:rFonts w:ascii="Times New Roman" w:hAnsi="Times New Roman" w:cs="Times New Roman"/>
-          <w:sz w:val="24"/>
-          <w:szCs w:val="24"/>
-        </w:rPr>
-        <w:t>, an interactive web dashboard built with Flask, and a Generative AI–powered natural language query interface using Google Gemini. The platform processes 210,500 synthetic retail transactions across 10,000 customers, 500 products, and 50,000 orders, providing actionable insights through a multi-page analytics dashboard and enabling non-technical stakeholders to query the data warehouse using plain English. The results demonstrate that modern cloud-native data architectures can deliver enterprise-grade analytics capabilities at minimal infrastructure cost, while GenAI integration dramatically reduces the barrier to data access for business users.</w:t>
+        <w:t>This capstone project presents a comprehensive enterprise-grade retail analytics platform designed to demonstrate modern data engineering and business intelligence practices. The system integrates synthetic data generation, cloud-based data warehousing on Snowflake, dimensional modeling with dbt, an interactive web dashboard built with Flask, and a Generative AI–powered natural language query interface using Google Gemini. The platform processes 210,500 synthetic retail transactions across 10,000 customers, 500 products, and 50,000 orders, providing actionable insights through a multi-page analytics dashboard and enabling non-technical stakeholders to query the data warehouse using plain English. The results demonstrate that modern cloud-native data architectures can deliver enterprise-grade analytics capabilities at minimal infrastructure cost, while GenAI integration dramatically reduces the barrier to data access for business users.</w:t>
       </w:r>
     </w:p>
     <w:p>
@@ -657,43 +655,7 @@
           <w:sz w:val="24"/>
           <w:szCs w:val="24"/>
         </w:rPr>
-        <w:t xml:space="preserve">This project builds an end-to-end enterprise retail analytics platform from the ground up. Rather than using pre-existing datasets, the system generates realistic synthetic data that mirrors real-world retail patterns, including seasonal demand fluctuations, customer purchase behavior following Zipf distributions, and category-specific pricing margins. The platform then ingests this data into Snowflake — a cloud-native data warehouse — transforms it using </w:t>
-      </w:r>
-      <w:proofErr w:type="spellStart"/>
-      <w:r>
-        <w:rPr>
-          <w:rFonts w:ascii="Times New Roman" w:hAnsi="Times New Roman" w:cs="Times New Roman"/>
-          <w:sz w:val="24"/>
-          <w:szCs w:val="24"/>
-        </w:rPr>
-        <w:t>dbt</w:t>
-      </w:r>
-      <w:proofErr w:type="spellEnd"/>
-      <w:r>
-        <w:rPr>
-          <w:rFonts w:ascii="Times New Roman" w:hAnsi="Times New Roman" w:cs="Times New Roman"/>
-          <w:sz w:val="24"/>
-          <w:szCs w:val="24"/>
-        </w:rPr>
-        <w:t xml:space="preserve"> (data build tool) into a star schema dimensional </w:t>
-      </w:r>
-      <w:proofErr w:type="gramStart"/>
-      <w:r>
-        <w:rPr>
-          <w:rFonts w:ascii="Times New Roman" w:hAnsi="Times New Roman" w:cs="Times New Roman"/>
-          <w:sz w:val="24"/>
-          <w:szCs w:val="24"/>
-        </w:rPr>
-        <w:t>model, and</w:t>
-      </w:r>
-      <w:proofErr w:type="gramEnd"/>
-      <w:r>
-        <w:rPr>
-          <w:rFonts w:ascii="Times New Roman" w:hAnsi="Times New Roman" w:cs="Times New Roman"/>
-          <w:sz w:val="24"/>
-          <w:szCs w:val="24"/>
-        </w:rPr>
-        <w:t xml:space="preserve"> presents the results through a premium web dashboard.</w:t>
+        <w:t>This project builds an end-to-end enterprise retail analytics platform from the ground up. Rather than using pre-existing datasets, the system generates realistic synthetic data that mirrors real-world retail patterns, including seasonal demand fluctuations, customer purchase behavior following Zipf distributions, and category-specific pricing margins. The platform then ingests this data into Snowflake — a cloud-native data warehouse — transforms it using dbt (data build tool) into a star schema dimensional model, and presents the results through a premium web dashboard.</w:t>
       </w:r>
     </w:p>
     <w:p>
@@ -835,25 +797,7 @@
           <w:sz w:val="24"/>
           <w:szCs w:val="24"/>
         </w:rPr>
-        <w:t xml:space="preserve">Traditional relational databases struggle with analytical workloads </w:t>
-      </w:r>
-      <w:proofErr w:type="gramStart"/>
-      <w:r>
-        <w:rPr>
-          <w:rFonts w:ascii="Times New Roman" w:hAnsi="Times New Roman" w:cs="Times New Roman"/>
-          <w:sz w:val="24"/>
-          <w:szCs w:val="24"/>
-        </w:rPr>
-        <w:t>at</w:t>
-      </w:r>
-      <w:proofErr w:type="gramEnd"/>
-      <w:r>
-        <w:rPr>
-          <w:rFonts w:ascii="Times New Roman" w:hAnsi="Times New Roman" w:cs="Times New Roman"/>
-          <w:sz w:val="24"/>
-          <w:szCs w:val="24"/>
-        </w:rPr>
-        <w:t xml:space="preserve"> scale</w:t>
+        <w:t>Traditional relational databases struggle with analytical workloads at scale</w:t>
       </w:r>
     </w:p>
     <w:p>
@@ -1077,38 +1021,19 @@
           <w:sz w:val="24"/>
           <w:szCs w:val="24"/>
         </w:rPr>
-        <w:t xml:space="preserve">Design a star </w:t>
-      </w:r>
-      <w:proofErr w:type="gramStart"/>
-      <w:r>
+        <w:t>Design a star schema optimized for analytical queries</w:t>
+      </w:r>
+    </w:p>
+    <w:p>
+      <w:pPr>
+        <w:pStyle w:val="ListNumber"/>
+        <w:spacing w:after="60"/>
         <w:rPr>
           <w:rFonts w:ascii="Times New Roman" w:hAnsi="Times New Roman" w:cs="Times New Roman"/>
           <w:sz w:val="24"/>
           <w:szCs w:val="24"/>
         </w:rPr>
-        <w:t>schema</w:t>
-      </w:r>
-      <w:proofErr w:type="gramEnd"/>
-      <w:r>
-        <w:rPr>
-          <w:rFonts w:ascii="Times New Roman" w:hAnsi="Times New Roman" w:cs="Times New Roman"/>
-          <w:sz w:val="24"/>
-          <w:szCs w:val="24"/>
-        </w:rPr>
-        <w:t xml:space="preserve"> optimized for analytical queries</w:t>
-      </w:r>
-    </w:p>
-    <w:p>
-      <w:pPr>
-        <w:pStyle w:val="ListNumber"/>
-        <w:spacing w:after="60"/>
-        <w:rPr>
-          <w:rFonts w:ascii="Times New Roman" w:hAnsi="Times New Roman" w:cs="Times New Roman"/>
-          <w:sz w:val="24"/>
-          <w:szCs w:val="24"/>
-        </w:rPr>
-      </w:pPr>
-      <w:proofErr w:type="spellStart"/>
+      </w:pPr>
       <w:r>
         <w:rPr>
           <w:rFonts w:ascii="Times New Roman" w:hAnsi="Times New Roman" w:cs="Times New Roman"/>
@@ -1116,9 +1041,27 @@
           <w:sz w:val="24"/>
           <w:szCs w:val="24"/>
         </w:rPr>
-        <w:t>dbt</w:t>
-      </w:r>
-      <w:proofErr w:type="spellEnd"/>
+        <w:t xml:space="preserve">dbt Transformations: </w:t>
+      </w:r>
+      <w:r>
+        <w:rPr>
+          <w:rFonts w:ascii="Times New Roman" w:hAnsi="Times New Roman" w:cs="Times New Roman"/>
+          <w:sz w:val="24"/>
+          <w:szCs w:val="24"/>
+        </w:rPr>
+        <w:t>Build a production-quality dbt project with staging, mart, and analytics layers</w:t>
+      </w:r>
+    </w:p>
+    <w:p>
+      <w:pPr>
+        <w:pStyle w:val="ListNumber"/>
+        <w:spacing w:after="60"/>
+        <w:rPr>
+          <w:rFonts w:ascii="Times New Roman" w:hAnsi="Times New Roman" w:cs="Times New Roman"/>
+          <w:sz w:val="24"/>
+          <w:szCs w:val="24"/>
+        </w:rPr>
+      </w:pPr>
       <w:r>
         <w:rPr>
           <w:rFonts w:ascii="Times New Roman" w:hAnsi="Times New Roman" w:cs="Times New Roman"/>
@@ -1126,7 +1069,7 @@
           <w:sz w:val="24"/>
           <w:szCs w:val="24"/>
         </w:rPr>
-        <w:t xml:space="preserve"> Transformations: </w:t>
+        <w:t xml:space="preserve">Interactive Dashboard: </w:t>
       </w:r>
       <w:r>
         <w:rPr>
@@ -1134,25 +1077,7 @@
           <w:sz w:val="24"/>
           <w:szCs w:val="24"/>
         </w:rPr>
-        <w:t xml:space="preserve">Build a production-quality </w:t>
-      </w:r>
-      <w:proofErr w:type="spellStart"/>
-      <w:r>
-        <w:rPr>
-          <w:rFonts w:ascii="Times New Roman" w:hAnsi="Times New Roman" w:cs="Times New Roman"/>
-          <w:sz w:val="24"/>
-          <w:szCs w:val="24"/>
-        </w:rPr>
-        <w:t>dbt</w:t>
-      </w:r>
-      <w:proofErr w:type="spellEnd"/>
-      <w:r>
-        <w:rPr>
-          <w:rFonts w:ascii="Times New Roman" w:hAnsi="Times New Roman" w:cs="Times New Roman"/>
-          <w:sz w:val="24"/>
-          <w:szCs w:val="24"/>
-        </w:rPr>
-        <w:t xml:space="preserve"> project with staging, mart, and analytics layers</w:t>
+        <w:t>Deliver a premium Flask web application with real-time visualizations</w:t>
       </w:r>
     </w:p>
     <w:p>
@@ -1172,34 +1097,6 @@
           <w:sz w:val="24"/>
           <w:szCs w:val="24"/>
         </w:rPr>
-        <w:t xml:space="preserve">Interactive Dashboard: </w:t>
-      </w:r>
-      <w:r>
-        <w:rPr>
-          <w:rFonts w:ascii="Times New Roman" w:hAnsi="Times New Roman" w:cs="Times New Roman"/>
-          <w:sz w:val="24"/>
-          <w:szCs w:val="24"/>
-        </w:rPr>
-        <w:t>Deliver a premium Flask web application with real-time visualizations</w:t>
-      </w:r>
-    </w:p>
-    <w:p>
-      <w:pPr>
-        <w:pStyle w:val="ListNumber"/>
-        <w:spacing w:after="60"/>
-        <w:rPr>
-          <w:rFonts w:ascii="Times New Roman" w:hAnsi="Times New Roman" w:cs="Times New Roman"/>
-          <w:sz w:val="24"/>
-          <w:szCs w:val="24"/>
-        </w:rPr>
-      </w:pPr>
-      <w:r>
-        <w:rPr>
-          <w:rFonts w:ascii="Times New Roman" w:hAnsi="Times New Roman" w:cs="Times New Roman"/>
-          <w:b/>
-          <w:sz w:val="24"/>
-          <w:szCs w:val="24"/>
-        </w:rPr>
         <w:t xml:space="preserve">GenAI Integration: </w:t>
       </w:r>
       <w:r>
@@ -1301,25 +1198,7 @@
           <w:sz w:val="24"/>
           <w:szCs w:val="24"/>
         </w:rPr>
-        <w:t xml:space="preserve">**Modeling Phase** (Days 3–4): </w:t>
-      </w:r>
-      <w:proofErr w:type="spellStart"/>
-      <w:r>
-        <w:rPr>
-          <w:rFonts w:ascii="Times New Roman" w:hAnsi="Times New Roman" w:cs="Times New Roman"/>
-          <w:sz w:val="24"/>
-          <w:szCs w:val="24"/>
-        </w:rPr>
-        <w:t>dbt</w:t>
-      </w:r>
-      <w:proofErr w:type="spellEnd"/>
-      <w:r>
-        <w:rPr>
-          <w:rFonts w:ascii="Times New Roman" w:hAnsi="Times New Roman" w:cs="Times New Roman"/>
-          <w:sz w:val="24"/>
-          <w:szCs w:val="24"/>
-        </w:rPr>
-        <w:t xml:space="preserve"> project, star schema, tests</w:t>
+        <w:t>**Modeling Phase** (Days 3–4): dbt project, star schema, tests</w:t>
       </w:r>
     </w:p>
     <w:p>
@@ -1853,37 +1732,12 @@
                 <w:rFonts w:ascii="Times New Roman" w:hAnsi="Times New Roman" w:cs="Times New Roman"/>
               </w:rPr>
             </w:pPr>
-            <w:proofErr w:type="spellStart"/>
             <w:r>
               <w:rPr>
                 <w:rFonts w:ascii="Times New Roman" w:hAnsi="Times New Roman" w:cs="Times New Roman"/>
                 <w:sz w:val="18"/>
               </w:rPr>
-              <w:t>dbt</w:t>
-            </w:r>
-            <w:proofErr w:type="spellEnd"/>
-            <w:r>
-              <w:rPr>
-                <w:rFonts w:ascii="Times New Roman" w:hAnsi="Times New Roman" w:cs="Times New Roman"/>
-                <w:sz w:val="18"/>
-              </w:rPr>
-              <w:t xml:space="preserve">-core, </w:t>
-            </w:r>
-            <w:proofErr w:type="spellStart"/>
-            <w:r>
-              <w:rPr>
-                <w:rFonts w:ascii="Times New Roman" w:hAnsi="Times New Roman" w:cs="Times New Roman"/>
-                <w:sz w:val="18"/>
-              </w:rPr>
-              <w:t>dbt</w:t>
-            </w:r>
-            <w:proofErr w:type="spellEnd"/>
-            <w:r>
-              <w:rPr>
-                <w:rFonts w:ascii="Times New Roman" w:hAnsi="Times New Roman" w:cs="Times New Roman"/>
-                <w:sz w:val="18"/>
-              </w:rPr>
-              <w:t>-snowflake</w:t>
+              <w:t>dbt-core, dbt-snowflake</w:t>
             </w:r>
           </w:p>
         </w:tc>
@@ -4572,25 +4426,7 @@
           <w:sz w:val="24"/>
           <w:szCs w:val="24"/>
         </w:rPr>
-        <w:t xml:space="preserve">One-year history: January 1, </w:t>
-      </w:r>
-      <w:proofErr w:type="gramStart"/>
-      <w:r>
-        <w:rPr>
-          <w:rFonts w:ascii="Times New Roman" w:hAnsi="Times New Roman" w:cs="Times New Roman"/>
-          <w:sz w:val="24"/>
-          <w:szCs w:val="24"/>
-        </w:rPr>
-        <w:t>2024</w:t>
-      </w:r>
-      <w:proofErr w:type="gramEnd"/>
-      <w:r>
-        <w:rPr>
-          <w:rFonts w:ascii="Times New Roman" w:hAnsi="Times New Roman" w:cs="Times New Roman"/>
-          <w:sz w:val="24"/>
-          <w:szCs w:val="24"/>
-        </w:rPr>
-        <w:t xml:space="preserve"> → December 31, 2024</w:t>
+        <w:t>One-year history: January 1, 2024 → December 31, 2024</w:t>
       </w:r>
     </w:p>
     <w:p>
@@ -6269,25 +6105,7 @@
           <w:color w:val="475569"/>
           <w:sz w:val="19"/>
         </w:rPr>
-        <w:t>│ date_key (</w:t>
-      </w:r>
-      <w:proofErr w:type="gramStart"/>
-      <w:r>
-        <w:rPr>
-          <w:rFonts w:ascii="Times New Roman" w:hAnsi="Times New Roman" w:cs="Times New Roman"/>
-          <w:color w:val="475569"/>
-          <w:sz w:val="19"/>
-        </w:rPr>
-        <w:t xml:space="preserve">PK)   </w:t>
-      </w:r>
-      <w:proofErr w:type="gramEnd"/>
-      <w:r>
-        <w:rPr>
-          <w:rFonts w:ascii="Times New Roman" w:hAnsi="Times New Roman" w:cs="Times New Roman"/>
-          <w:color w:val="475569"/>
-          <w:sz w:val="19"/>
-        </w:rPr>
-        <w:t xml:space="preserve">    │</w:t>
+        <w:t>│ date_key (PK)       │</w:t>
       </w:r>
     </w:p>
     <w:p>
@@ -6340,25 +6158,7 @@
           <w:color w:val="475569"/>
           <w:sz w:val="19"/>
         </w:rPr>
-        <w:t xml:space="preserve">│ </w:t>
-      </w:r>
-      <w:proofErr w:type="spellStart"/>
-      <w:r>
-        <w:rPr>
-          <w:rFonts w:ascii="Times New Roman" w:hAnsi="Times New Roman" w:cs="Times New Roman"/>
-          <w:color w:val="475569"/>
-          <w:sz w:val="19"/>
-        </w:rPr>
-        <w:t>date_actual</w:t>
-      </w:r>
-      <w:proofErr w:type="spellEnd"/>
-      <w:r>
-        <w:rPr>
-          <w:rFonts w:ascii="Times New Roman" w:hAnsi="Times New Roman" w:cs="Times New Roman"/>
-          <w:color w:val="475569"/>
-          <w:sz w:val="19"/>
-        </w:rPr>
-        <w:t xml:space="preserve">         │</w:t>
+        <w:t>│ date_actual         │</w:t>
       </w:r>
     </w:p>
     <w:p>
@@ -6411,25 +6211,7 @@
           <w:color w:val="475569"/>
           <w:sz w:val="19"/>
         </w:rPr>
-        <w:t xml:space="preserve">│ </w:t>
-      </w:r>
-      <w:proofErr w:type="spellStart"/>
-      <w:r>
-        <w:rPr>
-          <w:rFonts w:ascii="Times New Roman" w:hAnsi="Times New Roman" w:cs="Times New Roman"/>
-          <w:color w:val="475569"/>
-          <w:sz w:val="19"/>
-        </w:rPr>
-        <w:t>year_number</w:t>
-      </w:r>
-      <w:proofErr w:type="spellEnd"/>
-      <w:r>
-        <w:rPr>
-          <w:rFonts w:ascii="Times New Roman" w:hAnsi="Times New Roman" w:cs="Times New Roman"/>
-          <w:color w:val="475569"/>
-          <w:sz w:val="19"/>
-        </w:rPr>
-        <w:t xml:space="preserve">         │</w:t>
+        <w:t>│ year_number         │</w:t>
       </w:r>
     </w:p>
     <w:p>
@@ -6482,36 +6264,8 @@
           <w:color w:val="475569"/>
           <w:sz w:val="19"/>
         </w:rPr>
-        <w:t xml:space="preserve">│ </w:t>
-      </w:r>
-      <w:proofErr w:type="spellStart"/>
-      <w:r>
-        <w:rPr>
-          <w:rFonts w:ascii="Times New Roman" w:hAnsi="Times New Roman" w:cs="Times New Roman"/>
-          <w:color w:val="475569"/>
-          <w:sz w:val="19"/>
-        </w:rPr>
-        <w:t>quarter_</w:t>
-      </w:r>
-      <w:proofErr w:type="gramStart"/>
-      <w:r>
-        <w:rPr>
-          <w:rFonts w:ascii="Times New Roman" w:hAnsi="Times New Roman" w:cs="Times New Roman"/>
-          <w:color w:val="475569"/>
-          <w:sz w:val="19"/>
-        </w:rPr>
-        <w:t>number</w:t>
-      </w:r>
-      <w:proofErr w:type="spellEnd"/>
-      <w:r>
-        <w:rPr>
-          <w:rFonts w:ascii="Times New Roman" w:hAnsi="Times New Roman" w:cs="Times New Roman"/>
-          <w:color w:val="475569"/>
-          <w:sz w:val="19"/>
-        </w:rPr>
-        <w:t xml:space="preserve">      │</w:t>
-      </w:r>
-      <w:proofErr w:type="gramEnd"/>
+        <w:t>│ quarter_number      │</w:t>
+      </w:r>
     </w:p>
     <w:p>
       <w:pPr>
@@ -6563,25 +6317,7 @@
           <w:color w:val="475569"/>
           <w:sz w:val="19"/>
         </w:rPr>
-        <w:t xml:space="preserve">│ </w:t>
-      </w:r>
-      <w:proofErr w:type="spellStart"/>
-      <w:r>
-        <w:rPr>
-          <w:rFonts w:ascii="Times New Roman" w:hAnsi="Times New Roman" w:cs="Times New Roman"/>
-          <w:color w:val="475569"/>
-          <w:sz w:val="19"/>
-        </w:rPr>
-        <w:t>month_number</w:t>
-      </w:r>
-      <w:proofErr w:type="spellEnd"/>
-      <w:r>
-        <w:rPr>
-          <w:rFonts w:ascii="Times New Roman" w:hAnsi="Times New Roman" w:cs="Times New Roman"/>
-          <w:color w:val="475569"/>
-          <w:sz w:val="19"/>
-        </w:rPr>
-        <w:t xml:space="preserve">        │</w:t>
+        <w:t>│ month_number        │</w:t>
       </w:r>
     </w:p>
     <w:p>
@@ -6634,25 +6370,7 @@
           <w:color w:val="475569"/>
           <w:sz w:val="19"/>
         </w:rPr>
-        <w:t xml:space="preserve">│ </w:t>
-      </w:r>
-      <w:proofErr w:type="spellStart"/>
-      <w:r>
-        <w:rPr>
-          <w:rFonts w:ascii="Times New Roman" w:hAnsi="Times New Roman" w:cs="Times New Roman"/>
-          <w:color w:val="475569"/>
-          <w:sz w:val="19"/>
-        </w:rPr>
-        <w:t>month_name</w:t>
-      </w:r>
-      <w:proofErr w:type="spellEnd"/>
-      <w:r>
-        <w:rPr>
-          <w:rFonts w:ascii="Times New Roman" w:hAnsi="Times New Roman" w:cs="Times New Roman"/>
-          <w:color w:val="475569"/>
-          <w:sz w:val="19"/>
-        </w:rPr>
-        <w:t xml:space="preserve">          │</w:t>
+        <w:t>│ month_name          │</w:t>
       </w:r>
     </w:p>
     <w:p>
@@ -6705,25 +6423,7 @@
           <w:color w:val="475569"/>
           <w:sz w:val="19"/>
         </w:rPr>
-        <w:t xml:space="preserve">│ </w:t>
-      </w:r>
-      <w:proofErr w:type="spellStart"/>
-      <w:r>
-        <w:rPr>
-          <w:rFonts w:ascii="Times New Roman" w:hAnsi="Times New Roman" w:cs="Times New Roman"/>
-          <w:color w:val="475569"/>
-          <w:sz w:val="19"/>
-        </w:rPr>
-        <w:t>is_weekend</w:t>
-      </w:r>
-      <w:proofErr w:type="spellEnd"/>
-      <w:r>
-        <w:rPr>
-          <w:rFonts w:ascii="Times New Roman" w:hAnsi="Times New Roman" w:cs="Times New Roman"/>
-          <w:color w:val="475569"/>
-          <w:sz w:val="19"/>
-        </w:rPr>
-        <w:t xml:space="preserve">          │</w:t>
+        <w:t>│ is_weekend          │</w:t>
       </w:r>
     </w:p>
     <w:p>
@@ -6777,25 +6477,7 @@
           <w:sz w:val="19"/>
         </w:rPr>
         <w:lastRenderedPageBreak/>
-        <w:t xml:space="preserve">│ </w:t>
-      </w:r>
-      <w:proofErr w:type="spellStart"/>
-      <w:r>
-        <w:rPr>
-          <w:rFonts w:ascii="Times New Roman" w:hAnsi="Times New Roman" w:cs="Times New Roman"/>
-          <w:color w:val="475569"/>
-          <w:sz w:val="19"/>
-        </w:rPr>
-        <w:t>is_holiday_season</w:t>
-      </w:r>
-      <w:proofErr w:type="spellEnd"/>
-      <w:r>
-        <w:rPr>
-          <w:rFonts w:ascii="Times New Roman" w:hAnsi="Times New Roman" w:cs="Times New Roman"/>
-          <w:color w:val="475569"/>
-          <w:sz w:val="19"/>
-        </w:rPr>
-        <w:t xml:space="preserve">   │</w:t>
+        <w:t>│ is_holiday_season   │</w:t>
       </w:r>
     </w:p>
     <w:p>
@@ -7643,25 +7325,7 @@
           <w:color w:val="475569"/>
           <w:sz w:val="19"/>
         </w:rPr>
-        <w:t xml:space="preserve">│ </w:t>
-      </w:r>
-      <w:proofErr w:type="spellStart"/>
-      <w:r>
-        <w:rPr>
-          <w:rFonts w:ascii="Times New Roman" w:hAnsi="Times New Roman" w:cs="Times New Roman"/>
-          <w:color w:val="475569"/>
-          <w:sz w:val="19"/>
-        </w:rPr>
-        <w:t>discount_amount</w:t>
-      </w:r>
-      <w:proofErr w:type="spellEnd"/>
-      <w:r>
-        <w:rPr>
-          <w:rFonts w:ascii="Times New Roman" w:hAnsi="Times New Roman" w:cs="Times New Roman"/>
-          <w:color w:val="475569"/>
-          <w:sz w:val="19"/>
-        </w:rPr>
-        <w:t xml:space="preserve">           │    └──────────────────────┘</w:t>
+        <w:t>│ discount_amount           │    └──────────────────────┘</w:t>
       </w:r>
     </w:p>
     <w:p>
@@ -7714,25 +7378,7 @@
           <w:color w:val="475569"/>
           <w:sz w:val="19"/>
         </w:rPr>
-        <w:t xml:space="preserve">│ </w:t>
-      </w:r>
-      <w:proofErr w:type="spellStart"/>
-      <w:r>
-        <w:rPr>
-          <w:rFonts w:ascii="Times New Roman" w:hAnsi="Times New Roman" w:cs="Times New Roman"/>
-          <w:color w:val="475569"/>
-          <w:sz w:val="19"/>
-        </w:rPr>
-        <w:t>competitor_price_delta</w:t>
-      </w:r>
-      <w:proofErr w:type="spellEnd"/>
-      <w:r>
-        <w:rPr>
-          <w:rFonts w:ascii="Times New Roman" w:hAnsi="Times New Roman" w:cs="Times New Roman"/>
-          <w:color w:val="475569"/>
-          <w:sz w:val="19"/>
-        </w:rPr>
-        <w:t xml:space="preserve">    │</w:t>
+        <w:t>│ competitor_price_delta    │</w:t>
       </w:r>
     </w:p>
     <w:p>
@@ -15090,27 +14736,7 @@
           <w:color w:val="475569"/>
           <w:sz w:val="18"/>
         </w:rPr>
-        <w:t xml:space="preserve">Figure 6: </w:t>
-      </w:r>
-      <w:proofErr w:type="spellStart"/>
-      <w:r>
-        <w:rPr>
-          <w:rFonts w:ascii="Times New Roman" w:hAnsi="Times New Roman" w:cs="Times New Roman"/>
-          <w:i/>
-          <w:color w:val="475569"/>
-          <w:sz w:val="18"/>
-        </w:rPr>
-        <w:t>dbt</w:t>
-      </w:r>
-      <w:proofErr w:type="spellEnd"/>
-      <w:r>
-        <w:rPr>
-          <w:rFonts w:ascii="Times New Roman" w:hAnsi="Times New Roman" w:cs="Times New Roman"/>
-          <w:i/>
-          <w:color w:val="475569"/>
-          <w:sz w:val="18"/>
-        </w:rPr>
-        <w:t xml:space="preserve"> DAG — Model lineage showing transformation pipeline</w:t>
+        <w:t>Figure 6: dbt DAG — Model lineage showing transformation pipeline</w:t>
       </w:r>
     </w:p>
     <w:p>
@@ -20792,27 +20418,7 @@
           <w:szCs w:val="28"/>
           <w:lang w:val="pt-BR"/>
         </w:rPr>
-        <w:t xml:space="preserve">Google AI. (2024). *Gemini API </w:t>
-      </w:r>
-      <w:proofErr w:type="spellStart"/>
-      <w:r>
-        <w:rPr>
-          <w:rFonts w:ascii="Times New Roman" w:hAnsi="Times New Roman" w:cs="Times New Roman"/>
-          <w:sz w:val="24"/>
-          <w:szCs w:val="28"/>
-          <w:lang w:val="pt-BR"/>
-        </w:rPr>
-        <w:t>Documentation</w:t>
-      </w:r>
-      <w:proofErr w:type="spellEnd"/>
-      <w:r>
-        <w:rPr>
-          <w:rFonts w:ascii="Times New Roman" w:hAnsi="Times New Roman" w:cs="Times New Roman"/>
-          <w:sz w:val="24"/>
-          <w:szCs w:val="28"/>
-          <w:lang w:val="pt-BR"/>
-        </w:rPr>
-        <w:t>*. https://ai.google.dev/docs</w:t>
+        <w:t>Google AI. (2024). *Gemini API Documentation*. https://ai.google.dev/docs</w:t>
       </w:r>
     </w:p>
     <w:p>

</xml_diff>